<commit_message>
Resume: repoint dead repo links, drop the cockpit name, state the forecasting work as real with a synthetic public package
Co-Authored-By: Claude Opus 5 <noreply@anthropic.com>
</commit_message>
<xml_diff>
--- a/assets/Tatva_Desai_HSBC_Combined_Quant_BDO_Resume.docx
+++ b/assets/Tatva_Desai_HSBC_Combined_Quant_BDO_Resume.docx
@@ -745,7 +745,7 @@
                 <w:color w:val="182536"/>
                 <w:sz w:val="18"/>
               </w:rPr>
-              <w:t>Wholesale Credit Early-Warning &amp; MI Cockpit</w:t>
+              <w:t>Wholesale Credit Early-Warning &amp; MI Monitor</w:t>
             </w:r>
           </w:p>
         </w:tc>
@@ -790,7 +790,7 @@
           <w:color w:val="535D69"/>
           <w:sz w:val="16"/>
         </w:rPr>
-        <w:t>Synthetic MI | DuckDB + Streamlit — github.com/tatvadesai/wholesale-credit-cockpit</w:t>
+        <w:t>Synthetic MI | DuckDB + Streamlit — github.com/tatvadesai/wholesale-credit-monitor</w:t>
       </w:r>
     </w:p>
     <w:p>
@@ -1060,7 +1060,7 @@
           <w:color w:val="535D69"/>
           <w:sz w:val="16"/>
         </w:rPr>
-        <w:t>Broker exports → FIFO + returns — github.com/tatvadesai/tearsheet</w:t>
+        <w:t>Broker exports → FIFO + returns — github.com/tatvadesai/portfolio-tearsheet</w:t>
       </w:r>
     </w:p>
     <w:p>
@@ -1221,7 +1221,33 @@
           <w:color w:val="182536"/>
           <w:sz w:val="17"/>
         </w:rPr>
-        <w:t>Built a time-aware weekly workflow on 1,463 fictional obs with fixed 52-week holdout; harmonic-regression MASE 0.664 vs 1.116 naive, 80.8% P80 coverage, privacy-scanned and reproducible.</w:t>
+        <w:t>Built the weekly demand-planning forecast pipeline for a regional distribution business, covering time-aware validation, model selection, forecast reconciliation and inventory planning.</w:t>
+      </w:r>
+    </w:p>
+    <w:p>
+      <w:pPr>
+        <w:spacing w:after="16"/>
+        <w:ind w:left="187" w:hanging="158"/>
+      </w:pPr>
+      <w:r>
+        <w:rPr>
+          <w:rFonts w:ascii="Aptos" w:hAnsi="Aptos"/>
+          <w:b/>
+          <w:i w:val="0"/>
+          <w:color w:val="205988"/>
+          <w:sz w:val="17"/>
+        </w:rPr>
+        <w:t xml:space="preserve">• </w:t>
+      </w:r>
+      <w:r>
+        <w:rPr>
+          <w:rFonts w:ascii="Aptos" w:hAnsi="Aptos"/>
+          <w:b w:val="0"/>
+          <w:i w:val="0"/>
+          <w:color w:val="182536"/>
+          <w:sz w:val="17"/>
+        </w:rPr>
+        <w:t>Published an anonymised synthetic reproduction of the method, as the underlying business data is confidential: 1,463 fictional weekly observations, fixed 52-week holdout, harmonic-regression MASE 0.664 vs 1.116 seasonal naive, 80.8% P80 coverage, with an automated privacy scan.</w:t>
       </w:r>
     </w:p>
     <w:p>
@@ -1265,7 +1291,7 @@
           <w:color w:val="535D69"/>
           <w:sz w:val="17"/>
         </w:rPr>
-        <w:t>Credit risk, PD scorecards, EL, MI, concentration, returns (XIRR/TTWR), VaR/CVaR</w:t>
+        <w:t>Credit risk, PD scorecards, expected loss, MI, concentration (HHI), returns (XIRR/TTWR), forecasting</w:t>
       </w:r>
       <w:r>
         <w:rPr>

</xml_diff>